<commit_message>
Update TG contact: deck CTA → t.me/sempertrade, remove from memo
Co-Authored-By: Claude Opus 4.7 (1M context) <noreply@anthropic.com>
</commit_message>
<xml_diff>
--- a/memo/Notch_Memo.docx
+++ b/memo/Notch_Memo.docx
@@ -93,7 +93,7 @@
           <w:sz w:val="18"/>
           <w:szCs w:val="18"/>
         </w:rPr>
-        <w:t xml:space="preserve">ops at notch.win  ·  t.me/lostinai</w:t>
+        <w:t xml:space="preserve">ops at notch.win</w:t>
       </w:r>
     </w:p>
     <w:p>
@@ -859,7 +859,7 @@
           <w:sz w:val="20"/>
           <w:szCs w:val="20"/>
         </w:rPr>
-        <w:t xml:space="preserve">ops at notch.win  ·  t.me/lostinai</w:t>
+        <w:t xml:space="preserve">ops at notch.win</w:t>
       </w:r>
     </w:p>
     <w:p>

</xml_diff>